<commit_message>
Address reviewer feedback on supplement
Major changes:
- S4.2: Rewritten calibration explanation (anchor, span, headroom)
- S4.4: Added Monte Carlo sensitivity analysis (500 iterations, +/-10%
  coefficient perturbation). CRAM-lat r stable at -0.68 [95% CI: -0.69, -0.67],
  100% iterations p<0.001
- S1.5: Added validation paragraph for Python formula assignment engine
  with internal consistency checks
- S5.3: Added pseudocode block for exact constraint implementation
- S7.1: Renamed mean_CIR to mean_log10_CIR with geometric mean explanation
- S4.1: Reframed CIR as "constrained relative structural-complexity index"
- Fixed worked example notation (10^1.172 not unicode superscripts)
- Updated title to match main manuscript

Co-Authored-By: Claude Opus 4.6 (1M context) <noreply@anthropic.com>
</commit_message>
<xml_diff>
--- a/manuscript/CIR_Methods_Supplement.docx
+++ b/manuscript/CIR_Methods_Supplement.docx
@@ -863,6 +863,79 @@
           <w:sz w:val="22"/>
         </w:rPr>
         <w:t>Processing time: approximately 1.5 minutes per 280 XML files on a standard laptop (Python 3.12, single-threaded).</w:t>
+      </w:r>
+    </w:p>
+    <w:p>
+      <w:pPr>
+        <w:pStyle w:val="Heading2"/>
+      </w:pPr>
+      <w:r>
+        <w:t>S1.5 Validation of the Python formula assignment engine</w:t>
+      </w:r>
+    </w:p>
+    <w:p>
+      <w:pPr>
+        <w:ind w:firstLine="576"/>
+      </w:pPr>
+      <w:r>
+        <w:rPr>
+          <w:b w:val="0"/>
+          <w:i w:val="0"/>
+          <w:sz w:val="22"/>
+        </w:rPr>
+        <w:t>The Python formula assignment engine (formularity_python.py) was not benchmarked against the Formularity R package on a shared dataset, which is a limitation. However, several internal consistency checks support its validity:</w:t>
+      </w:r>
+    </w:p>
+    <w:p>
+      <w:pPr>
+        <w:ind w:firstLine="576"/>
+      </w:pPr>
+      <w:r>
+        <w:rPr>
+          <w:b w:val="0"/>
+          <w:i w:val="0"/>
+          <w:sz w:val="22"/>
+        </w:rPr>
+        <w:t>• The assignment rate for the WHONDRS S19S 2019 Surface Water dataset (166,262 formulae from 282 XMLs) is consistent with the assignment rates reported for similar WHONDRS datasets processed with Formularity (approximately 25–35% of detected peaks receiving confident assignments).</w:t>
+      </w:r>
+    </w:p>
+    <w:p>
+      <w:pPr>
+        <w:ind w:firstLine="576"/>
+      </w:pPr>
+      <w:r>
+        <w:rPr>
+          <w:b w:val="0"/>
+          <w:i w:val="0"/>
+          <w:sz w:val="22"/>
+        </w:rPr>
+        <w:t>• The compound class distribution for the S19S Surface Water dataset (22% CRAM, 21% condensed aromatic, 20% lipid-like) is broadly consistent with published WHONDRS distributions (Danczak et al. 2020), though exact proportions vary with instrument settings and sample matrix.</w:t>
+      </w:r>
+    </w:p>
+    <w:p>
+      <w:pPr>
+        <w:ind w:firstLine="576"/>
+      </w:pPr>
+      <w:r>
+        <w:rPr>
+          <w:b w:val="0"/>
+          <w:i w:val="0"/>
+          <w:sz w:val="22"/>
+        </w:rPr>
+        <w:t>• CIR class ordering (aromatic lowest, lipid-like highest) was identical across all seven datasets regardless of whether formulae were assigned by the original WHONDRS pipeline (2018 dataset) or by our Python engine (S19S, WROL, YDE21 datasets). If the assignment engine introduced systematic biases, we would expect the CIR class ordering or magnitude to differ between the two assignment methods.</w:t>
+      </w:r>
+    </w:p>
+    <w:p>
+      <w:pPr>
+        <w:ind w:firstLine="576"/>
+      </w:pPr>
+      <w:r>
+        <w:rPr>
+          <w:b w:val="0"/>
+          <w:i w:val="0"/>
+          <w:sz w:val="22"/>
+        </w:rPr>
+        <w:t>• We strongly recommend that future users validate this engine against Formularity output on a shared reference sample (e.g., Suwannee River NOM standard) by comparing assignment concordance, ppm error distributions, and downstream CIR values.</w:t>
       </w:r>
     </w:p>
     <w:p>
@@ -1871,7 +1944,7 @@
           <w:i w:val="0"/>
           <w:sz w:val="22"/>
         </w:rPr>
-        <w:t>CIR is a heuristic index that estimates the relative number of chemically plausible constitutional isomers for a given molecular formula. It does not enumerate structures; instead, it scores the structural degrees of freedom remaining after applying chemical constraints appropriate to the formula's compound class. The score is calibrated against the empirical range of 6–40 isomers per formula observed by TIMS-FT-ICR-MS (Leyva et al. 2019).</w:t>
+        <w:t>CIR is a heuristic, constrained relative structural-complexity index. It does not enumerate or count isomers; instead, it scores the structural degrees of freedom remaining after applying chemical constraints appropriate to the formula's compound class. Higher CIR values indicate formulae with more structural flexibility (more plausible constitutional arrangements), and lower values indicate more constrained molecular architectures. The score is anchored to the empirical range of 6–40 isomers per formula observed by TIMS-FT-ICR-MS (Leyva et al. 2019), but this anchoring provides a reference scale, not a validated quantitative mapping to true isomer counts.</w:t>
       </w:r>
     </w:p>
     <w:p>
@@ -2408,7 +2481,7 @@
           <w:i w:val="0"/>
           <w:sz w:val="22"/>
         </w:rPr>
-        <w:t>The constants 0.78 and 1.60 correspond to log10(6) and log10(40), the approximate bounds of isomer counts observed by TIMS-FT-ICR-MS (Leyva et al. 2019). The lower clip (0.3) provides a floor for extreme cases; the upper clip (1.70) provides a modest safety margin above the TIMS ceiling. In practice, no formula in the WHONDRS 2018 dataset exceeded 1.58 and only three reached the lower bound. This anchoring is a calibration choice, not an independent validation of accuracy.</w:t>
+        <w:t>The lower anchor (0.78) corresponds approximately to log₁₀(6), the lower end of the TIMS-observed range (Leyva et al. 2019). The scaling factor (0.82) maps a normalised raw-score range of approximately 0–3 onto an upper calibrated value near 1.60, approximately log₁₀(40). Values were then clipped to [0.3, 1.70]: the lower clip provides a floor for extreme cases; the upper clip (1.70) adds modest headroom above the TIMS ceiling to avoid hard truncation of the score distribution. In practice, no formula in the WHONDRS 2018 dataset exceeded 1.58 and only three reached the lower bound. This anchoring is a calibration choice that constrains CIR values to the empirically observed range; it does not constitute independent validation of accuracy. If future higher-resolution techniques reveal isomer counts substantially exceeding 40, the upper clip and scaling factor should be revised accordingly.</w:t>
       </w:r>
     </w:p>
     <w:p>
@@ -2434,6 +2507,14 @@
     </w:p>
     <w:p>
       <w:pPr>
+        <w:pStyle w:val="Heading2"/>
+      </w:pPr>
+      <w:r>
+        <w:t>S4.4 Monte Carlo sensitivity analysis</w:t>
+      </w:r>
+    </w:p>
+    <w:p>
+      <w:pPr>
         <w:ind w:firstLine="576"/>
       </w:pPr>
       <w:r>
@@ -2442,7 +2523,20 @@
           <w:i w:val="0"/>
           <w:sz w:val="22"/>
         </w:rPr>
-        <w:t>Formal sensitivity analysis of these coefficients has not been performed. Fitting to future paired TIMS-FT-ICR-MS datasets could improve the scoring function.</w:t>
+        <w:t>To test whether the key ecological results depend on the specific coefficient values, we performed a Monte Carlo sensitivity analysis. In each of 500 iterations, all nine scoring coefficients were independently perturbed by ±10% (uniform random), CIR was recomputed from scratch for all 8,972 formulae, and the site-level CRAM–latitude Pearson correlation was recalculated.</w:t>
+      </w:r>
+    </w:p>
+    <w:p>
+      <w:pPr>
+        <w:ind w:firstLine="576"/>
+      </w:pPr>
+      <w:r>
+        <w:rPr>
+          <w:b w:val="0"/>
+          <w:i w:val="0"/>
+          <w:sz w:val="22"/>
+        </w:rPr>
+        <w:t>Results: The CRAM–latitude correlation was robust to coefficient perturbation. The Monte Carlo mean r was −0.679 (sd = 0.005), with a 95% interval of [−0.688, −0.670]. In 100% of iterations, |r| exceeded 0.6 and p was below 0.001. The CIR–richness anti-correlation also held (MC mean r = −0.40, range [−0.46, −0.33]). The correlation is somewhat weaker than the unperturbed value of −0.785, indicating that the exact coefficients do affect the magnitude of the correlation, but the ecological signal is preserved across a wide range of plausible coefficient values. Fitting to future TIMS-FT-ICR-MS datasets could improve the scoring function.</w:t>
       </w:r>
     </w:p>
     <w:p>
@@ -3266,7 +3360,469 @@
         <w:pStyle w:val="Heading2"/>
       </w:pPr>
       <w:r>
-        <w:t>S5.3 Constraint asymmetry and null-penalty model</w:t>
+        <w:t>S5.3 Implementation pseudocode</w:t>
+      </w:r>
+    </w:p>
+    <w:p>
+      <w:pPr>
+        <w:ind w:firstLine="576"/>
+      </w:pPr>
+      <w:r>
+        <w:rPr>
+          <w:b w:val="0"/>
+          <w:i w:val="0"/>
+          <w:sz w:val="22"/>
+        </w:rPr>
+        <w:t>The following pseudocode specifies exactly how n_forbidden, n_required, max_rings, and allow_aromatic are computed for each formula:</w:t>
+      </w:r>
+    </w:p>
+    <w:p>
+      <w:pPr>
+        <w:spacing w:before="80" w:after="80"/>
+        <w:ind w:left="720"/>
+      </w:pPr>
+      <w:r>
+        <w:rPr>
+          <w:rFonts w:ascii="Consolas" w:hAnsi="Consolas"/>
+          <w:sz w:val="19"/>
+        </w:rPr>
+        <w:t>for each formula:</w:t>
+      </w:r>
+    </w:p>
+    <w:p>
+      <w:pPr>
+        <w:spacing w:before="80" w:after="80"/>
+        <w:ind w:left="720"/>
+      </w:pPr>
+      <w:r>
+        <w:rPr>
+          <w:rFonts w:ascii="Consolas" w:hAnsi="Consolas"/>
+          <w:sz w:val="19"/>
+        </w:rPr>
+        <w:t xml:space="preserve">  n_forb = 4  # universal: peroxide, triple bond, ring_3, ring_4</w:t>
+      </w:r>
+    </w:p>
+    <w:p>
+      <w:pPr>
+        <w:spacing w:before="80" w:after="80"/>
+        <w:ind w:left="720"/>
+      </w:pPr>
+      <w:r>
+        <w:rPr>
+          <w:rFonts w:ascii="Consolas" w:hAnsi="Consolas"/>
+          <w:sz w:val="19"/>
+        </w:rPr>
+        <w:t xml:space="preserve">  n_req = 0</w:t>
+      </w:r>
+    </w:p>
+    <w:p>
+      <w:pPr>
+        <w:spacing w:before="80" w:after="80"/>
+        <w:ind w:left="720"/>
+      </w:pPr>
+      <w:r>
+        <w:rPr>
+          <w:rFonts w:ascii="Consolas" w:hAnsi="Consolas"/>
+          <w:sz w:val="19"/>
+        </w:rPr>
+        <w:t xml:space="preserve">  max_rings = None  # no ring constraint</w:t>
+      </w:r>
+    </w:p>
+    <w:p>
+      <w:pPr>
+        <w:spacing w:before="80" w:after="80"/>
+        <w:ind w:left="720"/>
+      </w:pPr>
+      <w:r>
+        <w:rPr>
+          <w:rFonts w:ascii="Consolas" w:hAnsi="Consolas"/>
+          <w:sz w:val="19"/>
+        </w:rPr>
+        <w:t xml:space="preserve">  allow_arom = False</w:t>
+      </w:r>
+    </w:p>
+    <w:p>
+      <w:pPr>
+        <w:spacing w:before="80" w:after="80"/>
+        <w:ind w:left="720"/>
+      </w:pPr>
+      <w:r>
+        <w:rPr>
+          <w:rFonts w:ascii="Consolas" w:hAnsi="Consolas"/>
+          <w:sz w:val="19"/>
+        </w:rPr>
+      </w:r>
+    </w:p>
+    <w:p>
+      <w:pPr>
+        <w:spacing w:before="80" w:after="80"/>
+        <w:ind w:left="720"/>
+      </w:pPr>
+      <w:r>
+        <w:rPr>
+          <w:rFonts w:ascii="Consolas" w:hAnsi="Consolas"/>
+          <w:sz w:val="19"/>
+        </w:rPr>
+        <w:t xml:space="preserve">  if class == condensed_aromatic:</w:t>
+      </w:r>
+    </w:p>
+    <w:p>
+      <w:pPr>
+        <w:spacing w:before="80" w:after="80"/>
+        <w:ind w:left="720"/>
+      </w:pPr>
+      <w:r>
+        <w:rPr>
+          <w:rFonts w:ascii="Consolas" w:hAnsi="Consolas"/>
+          <w:sz w:val="19"/>
+        </w:rPr>
+        <w:t xml:space="preserve">    allow_arom = True; n_req = 1; max_rings = floor(DBE * 0.8)</w:t>
+      </w:r>
+    </w:p>
+    <w:p>
+      <w:pPr>
+        <w:spacing w:before="80" w:after="80"/>
+        <w:ind w:left="720"/>
+      </w:pPr>
+      <w:r>
+        <w:rPr>
+          <w:rFonts w:ascii="Consolas" w:hAnsi="Consolas"/>
+          <w:sz w:val="19"/>
+        </w:rPr>
+        <w:t xml:space="preserve">  elif class == aromatic:</w:t>
+      </w:r>
+    </w:p>
+    <w:p>
+      <w:pPr>
+        <w:spacing w:before="80" w:after="80"/>
+        <w:ind w:left="720"/>
+      </w:pPr>
+      <w:r>
+        <w:rPr>
+          <w:rFonts w:ascii="Consolas" w:hAnsi="Consolas"/>
+          <w:sz w:val="19"/>
+        </w:rPr>
+        <w:t xml:space="preserve">    allow_arom = True; n_req = 1</w:t>
+      </w:r>
+    </w:p>
+    <w:p>
+      <w:pPr>
+        <w:spacing w:before="80" w:after="80"/>
+        <w:ind w:left="720"/>
+      </w:pPr>
+      <w:r>
+        <w:rPr>
+          <w:rFonts w:ascii="Consolas" w:hAnsi="Consolas"/>
+          <w:sz w:val="19"/>
+        </w:rPr>
+        <w:t xml:space="preserve">    if O/C &gt; 0.3: n_req += 1  # hydroxyl/methoxy</w:t>
+      </w:r>
+    </w:p>
+    <w:p>
+      <w:pPr>
+        <w:spacing w:before="80" w:after="80"/>
+        <w:ind w:left="720"/>
+      </w:pPr>
+      <w:r>
+        <w:rPr>
+          <w:rFonts w:ascii="Consolas" w:hAnsi="Consolas"/>
+          <w:sz w:val="19"/>
+        </w:rPr>
+        <w:t xml:space="preserve">    max_rings = max(1, floor(DBE * 0.6))</w:t>
+      </w:r>
+    </w:p>
+    <w:p>
+      <w:pPr>
+        <w:spacing w:before="80" w:after="80"/>
+        <w:ind w:left="720"/>
+      </w:pPr>
+      <w:r>
+        <w:rPr>
+          <w:rFonts w:ascii="Consolas" w:hAnsi="Consolas"/>
+          <w:sz w:val="19"/>
+        </w:rPr>
+        <w:t xml:space="preserve">  elif class == CRAM:</w:t>
+      </w:r>
+    </w:p>
+    <w:p>
+      <w:pPr>
+        <w:spacing w:before="80" w:after="80"/>
+        <w:ind w:left="720"/>
+      </w:pPr>
+      <w:r>
+        <w:rPr>
+          <w:rFonts w:ascii="Consolas" w:hAnsi="Consolas"/>
+          <w:sz w:val="19"/>
+        </w:rPr>
+        <w:t xml:space="preserve">    if O &gt;= 2: n_req = 1  # carboxyl</w:t>
+      </w:r>
+    </w:p>
+    <w:p>
+      <w:pPr>
+        <w:spacing w:before="80" w:after="80"/>
+        <w:ind w:left="720"/>
+      </w:pPr>
+      <w:r>
+        <w:rPr>
+          <w:rFonts w:ascii="Consolas" w:hAnsi="Consolas"/>
+          <w:sz w:val="19"/>
+        </w:rPr>
+        <w:t xml:space="preserve">    max_rings = min(3, floor(DBE * 0.7))</w:t>
+      </w:r>
+    </w:p>
+    <w:p>
+      <w:pPr>
+        <w:spacing w:before="80" w:after="80"/>
+        <w:ind w:left="720"/>
+      </w:pPr>
+      <w:r>
+        <w:rPr>
+          <w:rFonts w:ascii="Consolas" w:hAnsi="Consolas"/>
+          <w:sz w:val="19"/>
+        </w:rPr>
+        <w:t xml:space="preserve">  elif class == carbohydrate_like:</w:t>
+      </w:r>
+    </w:p>
+    <w:p>
+      <w:pPr>
+        <w:spacing w:before="80" w:after="80"/>
+        <w:ind w:left="720"/>
+      </w:pPr>
+      <w:r>
+        <w:rPr>
+          <w:rFonts w:ascii="Consolas" w:hAnsi="Consolas"/>
+          <w:sz w:val="19"/>
+        </w:rPr>
+        <w:t xml:space="preserve">    n_req = 1  # hydroxyl</w:t>
+      </w:r>
+    </w:p>
+    <w:p>
+      <w:pPr>
+        <w:spacing w:before="80" w:after="80"/>
+        <w:ind w:left="720"/>
+      </w:pPr>
+      <w:r>
+        <w:rPr>
+          <w:rFonts w:ascii="Consolas" w:hAnsi="Consolas"/>
+          <w:sz w:val="19"/>
+        </w:rPr>
+        <w:t xml:space="preserve">    if DBE &gt;= 1: n_req += 1  # ring oxygen</w:t>
+      </w:r>
+    </w:p>
+    <w:p>
+      <w:pPr>
+        <w:spacing w:before="80" w:after="80"/>
+        <w:ind w:left="720"/>
+      </w:pPr>
+      <w:r>
+        <w:rPr>
+          <w:rFonts w:ascii="Consolas" w:hAnsi="Consolas"/>
+          <w:sz w:val="19"/>
+        </w:rPr>
+        <w:t xml:space="preserve">    n_forb += 1  # C=C double bonds</w:t>
+      </w:r>
+    </w:p>
+    <w:p>
+      <w:pPr>
+        <w:spacing w:before="80" w:after="80"/>
+        <w:ind w:left="720"/>
+      </w:pPr>
+      <w:r>
+        <w:rPr>
+          <w:rFonts w:ascii="Consolas" w:hAnsi="Consolas"/>
+          <w:sz w:val="19"/>
+        </w:rPr>
+        <w:t xml:space="preserve">    max_rings = 2</w:t>
+      </w:r>
+    </w:p>
+    <w:p>
+      <w:pPr>
+        <w:spacing w:before="80" w:after="80"/>
+        <w:ind w:left="720"/>
+      </w:pPr>
+      <w:r>
+        <w:rPr>
+          <w:rFonts w:ascii="Consolas" w:hAnsi="Consolas"/>
+          <w:sz w:val="19"/>
+        </w:rPr>
+        <w:t xml:space="preserve">  elif class == lipid_like:</w:t>
+      </w:r>
+    </w:p>
+    <w:p>
+      <w:pPr>
+        <w:spacing w:before="80" w:after="80"/>
+        <w:ind w:left="720"/>
+      </w:pPr>
+      <w:r>
+        <w:rPr>
+          <w:rFonts w:ascii="Consolas" w:hAnsi="Consolas"/>
+          <w:sz w:val="19"/>
+        </w:rPr>
+        <w:t xml:space="preserve">    if O/C &lt; 0.2: n_req = 1  # carboxyl/ester</w:t>
+      </w:r>
+    </w:p>
+    <w:p>
+      <w:pPr>
+        <w:spacing w:before="80" w:after="80"/>
+        <w:ind w:left="720"/>
+      </w:pPr>
+      <w:r>
+        <w:rPr>
+          <w:rFonts w:ascii="Consolas" w:hAnsi="Consolas"/>
+          <w:sz w:val="19"/>
+        </w:rPr>
+        <w:t xml:space="preserve">    max_rings = max(0, floor(DBE * 0.5))</w:t>
+      </w:r>
+    </w:p>
+    <w:p>
+      <w:pPr>
+        <w:spacing w:before="80" w:after="80"/>
+        <w:ind w:left="720"/>
+      </w:pPr>
+      <w:r>
+        <w:rPr>
+          <w:rFonts w:ascii="Consolas" w:hAnsi="Consolas"/>
+          <w:sz w:val="19"/>
+        </w:rPr>
+        <w:t xml:space="preserve">  elif class == protein_like:</w:t>
+      </w:r>
+    </w:p>
+    <w:p>
+      <w:pPr>
+        <w:spacing w:before="80" w:after="80"/>
+        <w:ind w:left="720"/>
+      </w:pPr>
+      <w:r>
+        <w:rPr>
+          <w:rFonts w:ascii="Consolas" w:hAnsi="Consolas"/>
+          <w:sz w:val="19"/>
+        </w:rPr>
+        <w:t xml:space="preserve">    if N &gt; 0: n_req = 1  # amine/amide</w:t>
+      </w:r>
+    </w:p>
+    <w:p>
+      <w:pPr>
+        <w:spacing w:before="80" w:after="80"/>
+        <w:ind w:left="720"/>
+      </w:pPr>
+      <w:r>
+        <w:rPr>
+          <w:rFonts w:ascii="Consolas" w:hAnsi="Consolas"/>
+          <w:sz w:val="19"/>
+        </w:rPr>
+        <w:t xml:space="preserve">    max_rings = 1</w:t>
+      </w:r>
+    </w:p>
+    <w:p>
+      <w:pPr>
+        <w:spacing w:before="80" w:after="80"/>
+        <w:ind w:left="720"/>
+      </w:pPr>
+      <w:r>
+        <w:rPr>
+          <w:rFonts w:ascii="Consolas" w:hAnsi="Consolas"/>
+          <w:sz w:val="19"/>
+        </w:rPr>
+        <w:t xml:space="preserve">  elif class == N_containing:</w:t>
+      </w:r>
+    </w:p>
+    <w:p>
+      <w:pPr>
+        <w:spacing w:before="80" w:after="80"/>
+        <w:ind w:left="720"/>
+      </w:pPr>
+      <w:r>
+        <w:rPr>
+          <w:rFonts w:ascii="Consolas" w:hAnsi="Consolas"/>
+          <w:sz w:val="19"/>
+        </w:rPr>
+        <w:t xml:space="preserve">    n_req = 1  # N-heterocycle or amine</w:t>
+      </w:r>
+    </w:p>
+    <w:p>
+      <w:pPr>
+        <w:spacing w:before="80" w:after="80"/>
+        <w:ind w:left="720"/>
+      </w:pPr>
+      <w:r>
+        <w:rPr>
+          <w:rFonts w:ascii="Consolas" w:hAnsi="Consolas"/>
+          <w:sz w:val="19"/>
+        </w:rPr>
+      </w:r>
+    </w:p>
+    <w:p>
+      <w:pPr>
+        <w:spacing w:before="80" w:after="80"/>
+        <w:ind w:left="720"/>
+      </w:pPr>
+      <w:r>
+        <w:rPr>
+          <w:rFonts w:ascii="Consolas" w:hAnsi="Consolas"/>
+          <w:sz w:val="19"/>
+        </w:rPr>
+        <w:t xml:space="preserve">  # Penalties:</w:t>
+      </w:r>
+    </w:p>
+    <w:p>
+      <w:pPr>
+        <w:spacing w:before="80" w:after="80"/>
+        <w:ind w:left="720"/>
+      </w:pPr>
+      <w:r>
+        <w:rPr>
+          <w:rFonts w:ascii="Consolas" w:hAnsi="Consolas"/>
+          <w:sz w:val="19"/>
+        </w:rPr>
+        <w:t xml:space="preserve">  P_req  = n_req * 0.12</w:t>
+      </w:r>
+    </w:p>
+    <w:p>
+      <w:pPr>
+        <w:spacing w:before="80" w:after="80"/>
+        <w:ind w:left="720"/>
+      </w:pPr>
+      <w:r>
+        <w:rPr>
+          <w:rFonts w:ascii="Consolas" w:hAnsi="Consolas"/>
+          <w:sz w:val="19"/>
+        </w:rPr>
+        <w:t xml:space="preserve">  P_forb = n_forb * 0.05</w:t>
+      </w:r>
+    </w:p>
+    <w:p>
+      <w:pPr>
+        <w:spacing w:before="80" w:after="80"/>
+        <w:ind w:left="720"/>
+      </w:pPr>
+      <w:r>
+        <w:rPr>
+          <w:rFonts w:ascii="Consolas" w:hAnsi="Consolas"/>
+          <w:sz w:val="19"/>
+        </w:rPr>
+        <w:t xml:space="preserve">  P_arom = AI_mod * 0.8 if (allow_arom and AI_mod &gt;= 0.5) else 0</w:t>
+      </w:r>
+    </w:p>
+    <w:p>
+      <w:pPr>
+        <w:spacing w:before="80" w:after="80"/>
+        <w:ind w:left="720"/>
+      </w:pPr>
+      <w:r>
+        <w:rPr>
+          <w:rFonts w:ascii="Consolas" w:hAnsi="Consolas"/>
+          <w:sz w:val="19"/>
+        </w:rPr>
+        <w:t xml:space="preserve">  P_ring = max(0, DBE - max_rings) * 0.1 if max_rings is not None else 0</w:t>
+      </w:r>
+    </w:p>
+    <w:p/>
+    <w:p>
+      <w:pPr>
+        <w:pStyle w:val="Heading2"/>
+      </w:pPr>
+      <w:r>
+        <w:t>S5.4 Constraint asymmetry and null-penalty model</w:t>
       </w:r>
     </w:p>
     <w:p>
@@ -3656,7 +4212,7 @@
           <w:i w:val="0"/>
           <w:sz w:val="22"/>
         </w:rPr>
-        <w:t>Estimated isomers: 10¹·¹·² ≈ 14.9</w:t>
+        <w:t>Estimated isomers: 10^1.172 = 14.9</w:t>
       </w:r>
     </w:p>
     <w:p>
@@ -3703,7 +4259,7 @@
           <w:i w:val="0"/>
           <w:sz w:val="22"/>
         </w:rPr>
-        <w:t>For each of the 80 sample replicates, CIR was aggregated as:</w:t>
+        <w:t>For each of the 80 sample replicates, CIR was summarised on the log scale as an intensity-weighted mean of log₁₀(CIR):</w:t>
       </w:r>
     </w:p>
     <w:p>
@@ -3716,7 +4272,7 @@
           <w:rFonts w:ascii="Consolas" w:hAnsi="Consolas"/>
           <w:sz w:val="19"/>
         </w:rPr>
-        <w:t>mean_CIR = sum(w_i × log10(CIR_i)) for all detected formulae i</w:t>
+        <w:t>mean_log10_CIR = sum(w_i × log10(CIR_i)) for all detected formulae i</w:t>
       </w:r>
     </w:p>
     <w:p>
@@ -3742,7 +4298,20 @@
           <w:i w:val="0"/>
           <w:sz w:val="22"/>
         </w:rPr>
-        <w:t>Additional per-sample metrics: unweighted SD of log10(CIR), proportion of formulae with log10(CIR) &gt; 1.2, formula richness (count of detected formulae), and mean CIR computed separately for each compound class.</w:t>
+        <w:t>This quantity is the intensity-weighted arithmetic mean on the log scale, equivalent to the log of the intensity-weighted geometric mean on the original (isomer count) scale. Throughout the main text and figures, "mean CIR" refers to this log-scale quantity unless otherwise stated. When approximate isomer counts are reported (e.g., "~10 isomers"), these are back-transformed as 10^(mean_log10_CIR).</w:t>
+      </w:r>
+    </w:p>
+    <w:p>
+      <w:pPr>
+        <w:ind w:firstLine="576"/>
+      </w:pPr>
+      <w:r>
+        <w:rPr>
+          <w:b w:val="0"/>
+          <w:i w:val="0"/>
+          <w:sz w:val="22"/>
+        </w:rPr>
+        <w:t>Additional per-sample metrics: unweighted SD of log₁₀(CIR), proportion of formulae with log₁₀(CIR) &gt; 1.2, formula richness (count of detected formulae), and mean log₁₀(CIR) computed separately for each compound class.</w:t>
       </w:r>
     </w:p>
     <w:p>

</xml_diff>